<commit_message>
chore: initialize project documentation, agent workflows, and core skill configurations
</commit_message>
<xml_diff>
--- a/docs/makeup_platform_srs.docx
+++ b/docs/makeup_platform_srs.docx
@@ -178,7 +178,7 @@
           <w:sz w:val="21"/>
           <w:szCs w:val="21"/>
         </w:rPr>
-        <w:t xml:space="preserve">Đầy đủ Đặc tả Backend Microservices, Frontend Multi-platform &amp; Bảng phân rã công việc 45 ngày.</w:t>
+        <w:t xml:space="preserve">Đầy đủ Đặc tả Backend Microservices, Mô hình Phân quyền RBAC 4 Bảng (users, roles, user_roles, role_permissions), Thiết kế Database PostgreSQL + PostGIS, Frontend Multi-platform &amp; Bảng WBS 45 ngày.</w:t>
       </w:r>
     </w:p>
     <w:p>
@@ -416,6 +416,7 @@
       </w:tblGrid>
       <w:tr>
         <w:trPr>
+          <w:cantSplit/>
           <w:tblHeader/>
         </w:trPr>
         <w:tc>
@@ -476,6 +477,9 @@
         </w:tc>
       </w:tr>
       <w:tr>
+        <w:trPr>
+          <w:cantSplit/>
+        </w:trPr>
         <w:tc>
           <w:tcPr>
             <w:tcW w:type="pct" w:w="30%"/>
@@ -534,6 +538,9 @@
         </w:tc>
       </w:tr>
       <w:tr>
+        <w:trPr>
+          <w:cantSplit/>
+        </w:trPr>
         <w:tc>
           <w:tcPr>
             <w:tcW w:type="pct" w:w="30%"/>
@@ -592,6 +599,9 @@
         </w:tc>
       </w:tr>
       <w:tr>
+        <w:trPr>
+          <w:cantSplit/>
+        </w:trPr>
         <w:tc>
           <w:tcPr>
             <w:tcW w:type="pct" w:w="30%"/>
@@ -650,6 +660,9 @@
         </w:tc>
       </w:tr>
       <w:tr>
+        <w:trPr>
+          <w:cantSplit/>
+        </w:trPr>
         <w:tc>
           <w:tcPr>
             <w:tcW w:type="pct" w:w="30%"/>
@@ -708,6 +721,9 @@
         </w:tc>
       </w:tr>
       <w:tr>
+        <w:trPr>
+          <w:cantSplit/>
+        </w:trPr>
         <w:tc>
           <w:tcPr>
             <w:tcW w:type="pct" w:w="30%"/>
@@ -766,6 +782,9 @@
         </w:tc>
       </w:tr>
       <w:tr>
+        <w:trPr>
+          <w:cantSplit/>
+        </w:trPr>
         <w:tc>
           <w:tcPr>
             <w:tcW w:type="pct" w:w="30%"/>
@@ -824,6 +843,9 @@
         </w:tc>
       </w:tr>
       <w:tr>
+        <w:trPr>
+          <w:cantSplit/>
+        </w:trPr>
         <w:tc>
           <w:tcPr>
             <w:tcW w:type="pct" w:w="30%"/>
@@ -882,6 +904,9 @@
         </w:tc>
       </w:tr>
       <w:tr>
+        <w:trPr>
+          <w:cantSplit/>
+        </w:trPr>
         <w:tc>
           <w:tcPr>
             <w:tcW w:type="pct" w:w="30%"/>
@@ -940,6 +965,9 @@
         </w:tc>
       </w:tr>
       <w:tr>
+        <w:trPr>
+          <w:cantSplit/>
+        </w:trPr>
         <w:tc>
           <w:tcPr>
             <w:tcW w:type="pct" w:w="30%"/>
@@ -998,6 +1026,9 @@
         </w:tc>
       </w:tr>
       <w:tr>
+        <w:trPr>
+          <w:cantSplit/>
+        </w:trPr>
         <w:tc>
           <w:tcPr>
             <w:tcW w:type="pct" w:w="30%"/>
@@ -1056,6 +1087,9 @@
         </w:tc>
       </w:tr>
       <w:tr>
+        <w:trPr>
+          <w:cantSplit/>
+        </w:trPr>
         <w:tc>
           <w:tcPr>
             <w:tcW w:type="pct" w:w="30%"/>
@@ -1114,6 +1148,9 @@
         </w:tc>
       </w:tr>
       <w:tr>
+        <w:trPr>
+          <w:cantSplit/>
+        </w:trPr>
         <w:tc>
           <w:tcPr>
             <w:tcW w:type="pct" w:w="30%"/>
@@ -1172,6 +1209,9 @@
         </w:tc>
       </w:tr>
       <w:tr>
+        <w:trPr>
+          <w:cantSplit/>
+        </w:trPr>
         <w:tc>
           <w:tcPr>
             <w:tcW w:type="pct" w:w="30%"/>
@@ -1230,6 +1270,9 @@
         </w:tc>
       </w:tr>
       <w:tr>
+        <w:trPr>
+          <w:cantSplit/>
+        </w:trPr>
         <w:tc>
           <w:tcPr>
             <w:tcW w:type="pct" w:w="30%"/>
@@ -1381,7 +1424,7 @@
           <w:sz w:val="21"/>
           <w:szCs w:val="21"/>
         </w:rPr>
-        <w:t xml:space="preserve">3. User, Agency &amp; MUA Profile Service: (Spring Boot + PostgreSQL) Auth OAuth2/JWT, Profile 3 nhóm, Phân quyền RBAC.</w:t>
+        <w:t xml:space="preserve">3. User, Agency &amp; MUA Profile Service: (Spring Boot + PostgreSQL) Auth OAuth2/JWT, Profile 3 nhóm, Phân quyền RBAC 4 Bảng (users, roles, user_roles, role_permissions).</w:t>
       </w:r>
     </w:p>
     <w:p>
@@ -1849,6 +1892,7 @@
       </w:tblGrid>
       <w:tr>
         <w:trPr>
+          <w:cantSplit/>
           <w:tblHeader/>
         </w:trPr>
         <w:tc>
@@ -1965,6 +2009,9 @@
         </w:tc>
       </w:tr>
       <w:tr>
+        <w:trPr>
+          <w:cantSplit/>
+        </w:trPr>
         <w:tc>
           <w:tcPr>
             <w:tcW w:type="pct" w:w="20%"/>
@@ -2079,6 +2126,9 @@
         </w:tc>
       </w:tr>
       <w:tr>
+        <w:trPr>
+          <w:cantSplit/>
+        </w:trPr>
         <w:tc>
           <w:tcPr>
             <w:tcW w:type="pct" w:w="20%"/>
@@ -2193,6 +2243,9 @@
         </w:tc>
       </w:tr>
       <w:tr>
+        <w:trPr>
+          <w:cantSplit/>
+        </w:trPr>
         <w:tc>
           <w:tcPr>
             <w:tcW w:type="pct" w:w="20%"/>
@@ -2307,6 +2360,9 @@
         </w:tc>
       </w:tr>
       <w:tr>
+        <w:trPr>
+          <w:cantSplit/>
+        </w:trPr>
         <w:tc>
           <w:tcPr>
             <w:tcW w:type="pct" w:w="20%"/>
@@ -2421,6 +2477,9 @@
         </w:tc>
       </w:tr>
       <w:tr>
+        <w:trPr>
+          <w:cantSplit/>
+        </w:trPr>
         <w:tc>
           <w:tcPr>
             <w:tcW w:type="pct" w:w="20%"/>
@@ -2535,6 +2594,9 @@
         </w:tc>
       </w:tr>
       <w:tr>
+        <w:trPr>
+          <w:cantSplit/>
+        </w:trPr>
         <w:tc>
           <w:tcPr>
             <w:tcW w:type="pct" w:w="20%"/>
@@ -2649,6 +2711,9 @@
         </w:tc>
       </w:tr>
       <w:tr>
+        <w:trPr>
+          <w:cantSplit/>
+        </w:trPr>
         <w:tc>
           <w:tcPr>
             <w:tcW w:type="pct" w:w="20%"/>
@@ -2763,6 +2828,9 @@
         </w:tc>
       </w:tr>
       <w:tr>
+        <w:trPr>
+          <w:cantSplit/>
+        </w:trPr>
         <w:tc>
           <w:tcPr>
             <w:tcW w:type="pct" w:w="20%"/>
@@ -2877,6 +2945,9 @@
         </w:tc>
       </w:tr>
       <w:tr>
+        <w:trPr>
+          <w:cantSplit/>
+        </w:trPr>
         <w:tc>
           <w:tcPr>
             <w:tcW w:type="pct" w:w="20%"/>
@@ -2991,6 +3062,9 @@
         </w:tc>
       </w:tr>
       <w:tr>
+        <w:trPr>
+          <w:cantSplit/>
+        </w:trPr>
         <w:tc>
           <w:tcPr>
             <w:tcW w:type="pct" w:w="20%"/>
@@ -3105,6 +3179,9 @@
         </w:tc>
       </w:tr>
       <w:tr>
+        <w:trPr>
+          <w:cantSplit/>
+        </w:trPr>
         <w:tc>
           <w:tcPr>
             <w:tcW w:type="pct" w:w="20%"/>
@@ -3219,6 +3296,9 @@
         </w:tc>
       </w:tr>
       <w:tr>
+        <w:trPr>
+          <w:cantSplit/>
+        </w:trPr>
         <w:tc>
           <w:tcPr>
             <w:tcW w:type="pct" w:w="20%"/>
@@ -3333,6 +3413,9 @@
         </w:tc>
       </w:tr>
       <w:tr>
+        <w:trPr>
+          <w:cantSplit/>
+        </w:trPr>
         <w:tc>
           <w:tcPr>
             <w:tcW w:type="pct" w:w="20%"/>
@@ -3505,6 +3588,7 @@
       </w:tblGrid>
       <w:tr>
         <w:trPr>
+          <w:cantSplit/>
           <w:tblHeader/>
         </w:trPr>
         <w:tc>
@@ -3593,6 +3677,9 @@
         </w:tc>
       </w:tr>
       <w:tr>
+        <w:trPr>
+          <w:cantSplit/>
+        </w:trPr>
         <w:tc>
           <w:tcPr>
             <w:tcW w:type="pct" w:w="25%"/>
@@ -3810,6 +3897,9 @@
         </w:tc>
       </w:tr>
       <w:tr>
+        <w:trPr>
+          <w:cantSplit/>
+        </w:trPr>
         <w:tc>
           <w:tcPr>
             <w:tcW w:type="pct" w:w="25%"/>
@@ -4027,6 +4117,9 @@
         </w:tc>
       </w:tr>
       <w:tr>
+        <w:trPr>
+          <w:cantSplit/>
+        </w:trPr>
         <w:tc>
           <w:tcPr>
             <w:tcW w:type="pct" w:w="25%"/>
@@ -4223,6 +4316,9 @@
         </w:tc>
       </w:tr>
       <w:tr>
+        <w:trPr>
+          <w:cantSplit/>
+        </w:trPr>
         <w:tc>
           <w:tcPr>
             <w:tcW w:type="pct" w:w="25%"/>
@@ -4419,6 +4515,9 @@
         </w:tc>
       </w:tr>
       <w:tr>
+        <w:trPr>
+          <w:cantSplit/>
+        </w:trPr>
         <w:tc>
           <w:tcPr>
             <w:tcW w:type="pct" w:w="25%"/>
@@ -4615,6 +4714,9 @@
         </w:tc>
       </w:tr>
       <w:tr>
+        <w:trPr>
+          <w:cantSplit/>
+        </w:trPr>
         <w:tc>
           <w:tcPr>
             <w:tcW w:type="pct" w:w="25%"/>
@@ -4831,6 +4933,7 @@
       </w:tblGrid>
       <w:tr>
         <w:trPr>
+          <w:cantSplit/>
           <w:tblHeader/>
         </w:trPr>
         <w:tc>
@@ -4919,6 +5022,9 @@
         </w:tc>
       </w:tr>
       <w:tr>
+        <w:trPr>
+          <w:cantSplit/>
+        </w:trPr>
         <w:tc>
           <w:tcPr>
             <w:tcW w:type="pct" w:w="25%"/>
@@ -5094,6 +5200,9 @@
         </w:tc>
       </w:tr>
       <w:tr>
+        <w:trPr>
+          <w:cantSplit/>
+        </w:trPr>
         <w:tc>
           <w:tcPr>
             <w:tcW w:type="pct" w:w="25%"/>
@@ -5290,6 +5399,9 @@
         </w:tc>
       </w:tr>
       <w:tr>
+        <w:trPr>
+          <w:cantSplit/>
+        </w:trPr>
         <w:tc>
           <w:tcPr>
             <w:tcW w:type="pct" w:w="25%"/>
@@ -5449,6 +5561,9 @@
         </w:tc>
       </w:tr>
       <w:tr>
+        <w:trPr>
+          <w:cantSplit/>
+        </w:trPr>
         <w:tc>
           <w:tcPr>
             <w:tcW w:type="pct" w:w="25%"/>
@@ -5661,6 +5776,9 @@
         </w:tc>
       </w:tr>
       <w:tr>
+        <w:trPr>
+          <w:cantSplit/>
+        </w:trPr>
         <w:tc>
           <w:tcPr>
             <w:tcW w:type="pct" w:w="25%"/>
@@ -5898,6 +6016,7 @@
       </w:tblGrid>
       <w:tr>
         <w:trPr>
+          <w:cantSplit/>
           <w:tblHeader/>
         </w:trPr>
         <w:tc>
@@ -5986,6 +6105,9 @@
         </w:tc>
       </w:tr>
       <w:tr>
+        <w:trPr>
+          <w:cantSplit/>
+        </w:trPr>
         <w:tc>
           <w:tcPr>
             <w:tcW w:type="pct" w:w="25%"/>
@@ -6161,6 +6283,9 @@
         </w:tc>
       </w:tr>
       <w:tr>
+        <w:trPr>
+          <w:cantSplit/>
+        </w:trPr>
         <w:tc>
           <w:tcPr>
             <w:tcW w:type="pct" w:w="25%"/>
@@ -6378,6 +6503,9 @@
         </w:tc>
       </w:tr>
       <w:tr>
+        <w:trPr>
+          <w:cantSplit/>
+        </w:trPr>
         <w:tc>
           <w:tcPr>
             <w:tcW w:type="pct" w:w="25%"/>
@@ -6595,6 +6723,9 @@
         </w:tc>
       </w:tr>
       <w:tr>
+        <w:trPr>
+          <w:cantSplit/>
+        </w:trPr>
         <w:tc>
           <w:tcPr>
             <w:tcW w:type="pct" w:w="25%"/>
@@ -6770,6 +6901,9 @@
         </w:tc>
       </w:tr>
       <w:tr>
+        <w:trPr>
+          <w:cantSplit/>
+        </w:trPr>
         <w:tc>
           <w:tcPr>
             <w:tcW w:type="pct" w:w="25%"/>
@@ -6964,61 +7098,536 @@
           <w:sz w:val="32"/>
           <w:szCs w:val="32"/>
         </w:rPr>
-        <w:t xml:space="preserve">IV. Yêu cầu Chức năng Backend (Backend Functional Requirements)</w:t>
+        <w:t xml:space="preserve">IV. Thiết kế Chi tiết Cơ sở Dữ liệu (Database Design &amp; SQL Specification)</w:t>
       </w:r>
     </w:p>
-    <w:tbl>
-      <w:tblPr>
-        <w:tblW w:type="pct" w:w="100%"/>
-        <w:tblBorders>
-          <w:top w:val="single" w:color="auto" w:sz="4"/>
-          <w:left w:val="single" w:color="auto" w:sz="4"/>
-          <w:bottom w:val="single" w:color="auto" w:sz="4"/>
-          <w:right w:val="single" w:color="auto" w:sz="4"/>
-          <w:insideH w:val="single" w:color="auto" w:sz="4"/>
-          <w:insideV w:val="single" w:color="auto" w:sz="4"/>
-        </w:tblBorders>
-      </w:tblPr>
-      <w:tblGrid>
-        <w:gridCol w:w="100"/>
-      </w:tblGrid>
-      <w:tr>
-        <w:tc>
-          <w:tcPr>
-            <w:tcW w:type="pct" w:w="100%"/>
-            <w:tcBorders>
-              <w:top w:val="none"/>
-              <w:left w:val="single" w:color="1A365D" w:sz="24"/>
-              <w:bottom w:val="none"/>
-              <w:right w:val="none"/>
-            </w:tcBorders>
-            <w:shd w:fill="E2E8F0" w:val="clear"/>
-            <w:tcMar>
-              <w:top w:type="dxa" w:w="120"/>
-              <w:left w:type="dxa" w:w="180"/>
-              <w:bottom w:type="dxa" w:w="120"/>
-              <w:right w:type="dxa" w:w="180"/>
-            </w:tcMar>
-          </w:tcPr>
-          <w:p>
-            <w:pPr>
-              <w:spacing w:line="260"/>
-            </w:pPr>
-            <w:r>
-              <w:rPr>
-                <w:rFonts w:ascii="Segoe UI" w:cs="Segoe UI" w:eastAsia="Segoe UI" w:hAnsi="Segoe UI"/>
-                <w:b/>
-                <w:bCs/>
-                <w:color w:val="1A365D"/>
-                <w:sz w:val="21"/>
-                <w:szCs w:val="21"/>
-              </w:rPr>
-              <w:t xml:space="preserve">Backend hỗ trợ đầy đủ các API REST và WebSocket Event cho 3 Phân hệ: Đại lý (Studio Ops, Dispatching), Thợ tự do (Countdown Realtime Match, GPS Telemetry Stream) và Khách hàng (Discovery, Dynamic Pricing, Escrow Wallet).</w:t>
-            </w:r>
-          </w:p>
-        </w:tc>
-      </w:tr>
-    </w:tbl>
+    <w:p>
+      <w:pPr>
+        <w:spacing w:after="80" w:before="80" w:line="280"/>
+      </w:pPr>
+      <w:r>
+        <w:rPr>
+          <w:rFonts w:ascii="Segoe UI" w:cs="Segoe UI" w:eastAsia="Segoe UI" w:hAnsi="Segoe UI"/>
+          <w:b w:val="false"/>
+          <w:bCs w:val="false"/>
+          <w:color w:val="2D3748"/>
+          <w:sz w:val="22"/>
+          <w:szCs w:val="22"/>
+        </w:rPr>
+        <w:t xml:space="preserve">Cơ sở dữ liệu hệ thống áp dụng mô hình PostgreSQL 16 + PostGIS Extension chuẩn hóa 3NF kết hợp Phân quyền RBAC 4 Bảng (users, roles, user_roles, role_permissions):</w:t>
+      </w:r>
+    </w:p>
+    <w:p>
+      <w:pPr>
+        <w:pStyle w:val="Heading2"/>
+        <w:spacing w:after="120" w:before="240"/>
+      </w:pPr>
+      <w:r>
+        <w:rPr>
+          <w:rFonts w:ascii="Segoe UI" w:cs="Segoe UI" w:eastAsia="Segoe UI" w:hAnsi="Segoe UI"/>
+          <w:b/>
+          <w:bCs/>
+          <w:color w:val="2B6CB0"/>
+          <w:sz w:val="26"/>
+          <w:szCs w:val="26"/>
+        </w:rPr>
+        <w:t xml:space="preserve">Danh sách 26 Bảng Dữ liệu Cốt lõi (Bổ sung staff_portfolio_showcases, agency_staff_styles &amp; 7 Bảng Sổ cái Ví):</w:t>
+      </w:r>
+    </w:p>
+    <w:p>
+      <w:pPr>
+        <w:pStyle w:val="ListParagraph"/>
+        <w:numPr>
+          <w:ilvl w:val="0"/>
+          <w:numId w:val="1"/>
+        </w:numPr>
+        <w:spacing w:after="40" w:before="40" w:line="260"/>
+      </w:pPr>
+      <w:r>
+        <w:rPr>
+          <w:rFonts w:ascii="Segoe UI" w:cs="Segoe UI" w:eastAsia="Segoe UI" w:hAnsi="Segoe UI"/>
+          <w:color w:val="2D3748"/>
+          <w:sz w:val="21"/>
+          <w:szCs w:val="21"/>
+        </w:rPr>
+        <w:t xml:space="preserve">1. users: Quản lý tài khoản đăng nhập (Khách, Thợ tự do, Chủ Studio, Nhân viên Studio).</w:t>
+      </w:r>
+    </w:p>
+    <w:p>
+      <w:pPr>
+        <w:pStyle w:val="ListParagraph"/>
+        <w:numPr>
+          <w:ilvl w:val="0"/>
+          <w:numId w:val="1"/>
+        </w:numPr>
+        <w:spacing w:after="40" w:before="40" w:line="260"/>
+      </w:pPr>
+      <w:r>
+        <w:rPr>
+          <w:rFonts w:ascii="Segoe UI" w:cs="Segoe UI" w:eastAsia="Segoe UI" w:hAnsi="Segoe UI"/>
+          <w:color w:val="2D3748"/>
+          <w:sz w:val="21"/>
+          <w:szCs w:val="21"/>
+        </w:rPr>
+        <w:t xml:space="preserve">2. roles, user_roles &amp; role_permissions: Mô hình phân quyền RBAC 4 Bảng đầy đủ (ROLE_CUSTOMER, ROLE_FREELANCE_MUA, ROLE_AGENCY_ADMIN, ROLE_AGENCY_STAFF) và danh sách permission_code chi tiết.</w:t>
+      </w:r>
+    </w:p>
+    <w:p>
+      <w:pPr>
+        <w:pStyle w:val="ListParagraph"/>
+        <w:numPr>
+          <w:ilvl w:val="0"/>
+          <w:numId w:val="1"/>
+        </w:numPr>
+        <w:spacing w:after="40" w:before="40" w:line="260"/>
+      </w:pPr>
+      <w:r>
+        <w:rPr>
+          <w:rFonts w:ascii="Segoe UI" w:cs="Segoe UI" w:eastAsia="Segoe UI" w:hAnsi="Segoe UI"/>
+          <w:color w:val="2D3748"/>
+          <w:sz w:val="21"/>
+          <w:szCs w:val="21"/>
+        </w:rPr>
+        <w:t xml:space="preserve">3. agency_profiles: Hồ sơ Studio/Đại lý (Mã đại lý AG-HN-00182, hotline, tỷ lệ % hoa hồng studio/thợ).</w:t>
+      </w:r>
+    </w:p>
+    <w:p>
+      <w:pPr>
+        <w:pStyle w:val="ListParagraph"/>
+        <w:numPr>
+          <w:ilvl w:val="0"/>
+          <w:numId w:val="1"/>
+        </w:numPr>
+        <w:spacing w:after="40" w:before="40" w:line="260"/>
+      </w:pPr>
+      <w:r>
+        <w:rPr>
+          <w:rFonts w:ascii="Segoe UI" w:cs="Segoe UI" w:eastAsia="Segoe UI" w:hAnsi="Segoe UI"/>
+          <w:color w:val="2D3748"/>
+          <w:sz w:val="21"/>
+          <w:szCs w:val="21"/>
+        </w:rPr>
+        <w:t xml:space="preserve">4. mua_profiles: Hồ sơ Thợ trang điểm (Mã thợ MUA-2026-08912, portfolio ảnh Before/After JSONB, bán kính max km, rating).</w:t>
+      </w:r>
+    </w:p>
+    <w:p>
+      <w:pPr>
+        <w:pStyle w:val="ListParagraph"/>
+        <w:numPr>
+          <w:ilvl w:val="0"/>
+          <w:numId w:val="1"/>
+        </w:numPr>
+        <w:spacing w:after="40" w:before="40" w:line="260"/>
+      </w:pPr>
+      <w:r>
+        <w:rPr>
+          <w:rFonts w:ascii="Segoe UI" w:cs="Segoe UI" w:eastAsia="Segoe UI" w:hAnsi="Segoe UI"/>
+          <w:color w:val="2D3748"/>
+          <w:sz w:val="21"/>
+          <w:szCs w:val="21"/>
+        </w:rPr>
+        <w:t xml:space="preserve">5. agency_staff: Mối quan hệ thợ thuộc studio &amp; % hoa hồng thỏa thuận riêng.</w:t>
+      </w:r>
+    </w:p>
+    <w:p>
+      <w:pPr>
+        <w:pStyle w:val="ListParagraph"/>
+        <w:numPr>
+          <w:ilvl w:val="0"/>
+          <w:numId w:val="1"/>
+        </w:numPr>
+        <w:spacing w:after="40" w:before="40" w:line="260"/>
+      </w:pPr>
+      <w:r>
+        <w:rPr>
+          <w:rFonts w:ascii="Segoe UI" w:cs="Segoe UI" w:eastAsia="Segoe UI" w:hAnsi="Segoe UI"/>
+          <w:color w:val="2D3748"/>
+          <w:sz w:val="21"/>
+          <w:szCs w:val="21"/>
+        </w:rPr>
+        <w:t xml:space="preserve">6. master_service_categories: Danh mục loại Make-up chuẩn sàn (Make tiệc, Kỷ yếu, Cô dâu, Mẹ cô dâu, Người nhà...).</w:t>
+      </w:r>
+    </w:p>
+    <w:p>
+      <w:pPr>
+        <w:pStyle w:val="ListParagraph"/>
+        <w:numPr>
+          <w:ilvl w:val="0"/>
+          <w:numId w:val="1"/>
+        </w:numPr>
+        <w:spacing w:after="40" w:before="40" w:line="260"/>
+      </w:pPr>
+      <w:r>
+        <w:rPr>
+          <w:rFonts w:ascii="Segoe UI" w:cs="Segoe UI" w:eastAsia="Segoe UI" w:hAnsi="Segoe UI"/>
+          <w:color w:val="2D3748"/>
+          <w:sz w:val="21"/>
+          <w:szCs w:val="21"/>
+        </w:rPr>
+        <w:t xml:space="preserve">7. makeup_styles: Danh mục Tone/Phong cách trang điểm (Tone Thái, Douyin, Hồng Baby, Tone Tây, Tone Hàn...).</w:t>
+      </w:r>
+    </w:p>
+    <w:p>
+      <w:pPr>
+        <w:pStyle w:val="ListParagraph"/>
+        <w:numPr>
+          <w:ilvl w:val="0"/>
+          <w:numId w:val="1"/>
+        </w:numPr>
+        <w:spacing w:after="40" w:before="40" w:line="260"/>
+      </w:pPr>
+      <w:r>
+        <w:rPr>
+          <w:rFonts w:ascii="Segoe UI" w:cs="Segoe UI" w:eastAsia="Segoe UI" w:hAnsi="Segoe UI"/>
+          <w:color w:val="2D3748"/>
+          <w:sz w:val="21"/>
+          <w:szCs w:val="21"/>
+        </w:rPr>
+        <w:t xml:space="preserve">8. service_packages: Gói dịch vụ chi tiết của Thợ tự do hoặc Studio.</w:t>
+      </w:r>
+    </w:p>
+    <w:p>
+      <w:pPr>
+        <w:pStyle w:val="ListParagraph"/>
+        <w:numPr>
+          <w:ilvl w:val="0"/>
+          <w:numId w:val="1"/>
+        </w:numPr>
+        <w:spacing w:after="40" w:before="40" w:line="260"/>
+      </w:pPr>
+      <w:r>
+        <w:rPr>
+          <w:rFonts w:ascii="Segoe UI" w:cs="Segoe UI" w:eastAsia="Segoe UI" w:hAnsi="Segoe UI"/>
+          <w:color w:val="2D3748"/>
+          <w:sz w:val="21"/>
+          <w:szCs w:val="21"/>
+        </w:rPr>
+        <w:t xml:space="preserve">9. package_items: Chi tiết các bước thực hiện mặc định (item_type = COMPONENT) và Dịch vụ tùy chọn mua thêm (item_type = ADD-ON) như Làm tóc, Mi giả, Dưỡng ẩm...</w:t>
+      </w:r>
+    </w:p>
+    <w:p>
+      <w:pPr>
+        <w:pStyle w:val="ListParagraph"/>
+        <w:numPr>
+          <w:ilvl w:val="0"/>
+          <w:numId w:val="1"/>
+        </w:numPr>
+        <w:spacing w:after="40" w:before="40" w:line="260"/>
+      </w:pPr>
+      <w:r>
+        <w:rPr>
+          <w:rFonts w:ascii="Segoe UI" w:cs="Segoe UI" w:eastAsia="Segoe UI" w:hAnsi="Segoe UI"/>
+          <w:color w:val="2D3748"/>
+          <w:sz w:val="21"/>
+          <w:szCs w:val="21"/>
+        </w:rPr>
+        <w:t xml:space="preserve">10. package_styles: Bảng nối N-N liên kết gói dịch vụ với các Tone/Phong cách make-up.</w:t>
+      </w:r>
+    </w:p>
+    <w:p>
+      <w:pPr>
+        <w:pStyle w:val="ListParagraph"/>
+        <w:numPr>
+          <w:ilvl w:val="0"/>
+          <w:numId w:val="1"/>
+        </w:numPr>
+        <w:spacing w:after="40" w:before="40" w:line="260"/>
+      </w:pPr>
+      <w:r>
+        <w:rPr>
+          <w:rFonts w:ascii="Segoe UI" w:cs="Segoe UI" w:eastAsia="Segoe UI" w:hAnsi="Segoe UI"/>
+          <w:color w:val="2D3748"/>
+          <w:sz w:val="21"/>
+          <w:szCs w:val="21"/>
+        </w:rPr>
+        <w:t xml:space="preserve">11. agency_staff_services &amp; agency_staff_styles: Bảng gán kỹ năng Gói Dịch vụ &amp; kỹ năng Tone Make-up của từng thợ Studio (Douyin, Thái, Tây, Hàn...).</w:t>
+      </w:r>
+    </w:p>
+    <w:p>
+      <w:pPr>
+        <w:pStyle w:val="ListParagraph"/>
+        <w:numPr>
+          <w:ilvl w:val="0"/>
+          <w:numId w:val="1"/>
+        </w:numPr>
+        <w:spacing w:after="40" w:before="40" w:line="260"/>
+      </w:pPr>
+      <w:r>
+        <w:rPr>
+          <w:rFonts w:ascii="Segoe UI" w:cs="Segoe UI" w:eastAsia="Segoe UI" w:hAnsi="Segoe UI"/>
+          <w:color w:val="2D3748"/>
+          <w:sz w:val="21"/>
+          <w:szCs w:val="21"/>
+        </w:rPr>
+        <w:t xml:space="preserve">12. staff_portfolio_showcases: Quản lý Album Ảnh sản phẩm make-up hoàn thiện của khách trước đó theo từng [Gói Dịch Vụ + Tone Make-Up] của Thợ.</w:t>
+      </w:r>
+    </w:p>
+    <w:p>
+      <w:pPr>
+        <w:pStyle w:val="ListParagraph"/>
+        <w:numPr>
+          <w:ilvl w:val="0"/>
+          <w:numId w:val="1"/>
+        </w:numPr>
+        <w:spacing w:after="40" w:before="40" w:line="260"/>
+      </w:pPr>
+      <w:r>
+        <w:rPr>
+          <w:rFonts w:ascii="Segoe UI" w:cs="Segoe UI" w:eastAsia="Segoe UI" w:hAnsi="Segoe UI"/>
+          <w:color w:val="2D3748"/>
+          <w:sz w:val="21"/>
+          <w:szCs w:val="21"/>
+        </w:rPr>
+        <w:t xml:space="preserve">13. surcharges: Cấu hình phụ phí làm sớm (3h-5h sáng), phụ phí đi tỉnh, phụ phí ngày Lễ/Tết.</w:t>
+      </w:r>
+    </w:p>
+    <w:p>
+      <w:pPr>
+        <w:pStyle w:val="ListParagraph"/>
+        <w:numPr>
+          <w:ilvl w:val="0"/>
+          <w:numId w:val="1"/>
+        </w:numPr>
+        <w:spacing w:after="40" w:before="40" w:line="260"/>
+      </w:pPr>
+      <w:r>
+        <w:rPr>
+          <w:rFonts w:ascii="Segoe UI" w:cs="Segoe UI" w:eastAsia="Segoe UI" w:hAnsi="Segoe UI"/>
+          <w:color w:val="2D3748"/>
+          <w:sz w:val="21"/>
+          <w:szCs w:val="21"/>
+        </w:rPr>
+        <w:t xml:space="preserve">14. bookings: Đơn đặt lịch chính (Mã đơn BK-260908-A9X2K, loại Realtime/Scheduled, luồng Direct/Agency, trạng thái, tổng tiền).</w:t>
+      </w:r>
+    </w:p>
+    <w:p>
+      <w:pPr>
+        <w:pStyle w:val="ListParagraph"/>
+        <w:numPr>
+          <w:ilvl w:val="0"/>
+          <w:numId w:val="1"/>
+        </w:numPr>
+        <w:spacing w:after="40" w:before="40" w:line="260"/>
+      </w:pPr>
+      <w:r>
+        <w:rPr>
+          <w:rFonts w:ascii="Segoe UI" w:cs="Segoe UI" w:eastAsia="Segoe UI" w:hAnsi="Segoe UI"/>
+          <w:color w:val="2D3748"/>
+          <w:sz w:val="21"/>
+          <w:szCs w:val="21"/>
+        </w:rPr>
+        <w:t xml:space="preserve">15. booking_items &amp; booking_history: Chi tiết gói dịch vụ được đặt &amp; Nhật ký audit log máy trạng thái đơn hàng.</w:t>
+      </w:r>
+    </w:p>
+    <w:p>
+      <w:pPr>
+        <w:pStyle w:val="ListParagraph"/>
+        <w:numPr>
+          <w:ilvl w:val="0"/>
+          <w:numId w:val="1"/>
+        </w:numPr>
+        <w:spacing w:after="40" w:before="40" w:line="260"/>
+      </w:pPr>
+      <w:r>
+        <w:rPr>
+          <w:rFonts w:ascii="Segoe UI" w:cs="Segoe UI" w:eastAsia="Segoe UI" w:hAnsi="Segoe UI"/>
+          <w:color w:val="2D3748"/>
+          <w:sz w:val="21"/>
+          <w:szCs w:val="21"/>
+        </w:rPr>
+        <w:t xml:space="preserve">16. mua_calendars: Lịch bận cá nhân của thợ (Block Calendar) chống trùng ca.</w:t>
+      </w:r>
+    </w:p>
+    <w:p>
+      <w:pPr>
+        <w:pStyle w:val="ListParagraph"/>
+        <w:numPr>
+          <w:ilvl w:val="0"/>
+          <w:numId w:val="1"/>
+        </w:numPr>
+        <w:spacing w:after="40" w:before="40" w:line="260"/>
+      </w:pPr>
+      <w:r>
+        <w:rPr>
+          <w:rFonts w:ascii="Segoe UI" w:cs="Segoe UI" w:eastAsia="Segoe UI" w:hAnsi="Segoe UI"/>
+          <w:color w:val="2D3748"/>
+          <w:sz w:val="21"/>
+          <w:szCs w:val="21"/>
+        </w:rPr>
+        <w:t xml:space="preserve">17. telemetry_logs: Lịch sử tọa độ GPS thợ di chuyển (Sử dụng kiểu dữ liệu PostGIS GEOMETRY Point SRID 4326).</w:t>
+      </w:r>
+    </w:p>
+    <w:p>
+      <w:pPr>
+        <w:pStyle w:val="ListParagraph"/>
+        <w:numPr>
+          <w:ilvl w:val="0"/>
+          <w:numId w:val="1"/>
+        </w:numPr>
+        <w:spacing w:after="40" w:before="40" w:line="260"/>
+      </w:pPr>
+      <w:r>
+        <w:rPr>
+          <w:rFonts w:ascii="Segoe UI" w:cs="Segoe UI" w:eastAsia="Segoe UI" w:hAnsi="Segoe UI"/>
+          <w:color w:val="2D3748"/>
+          <w:sz w:val="21"/>
+          <w:szCs w:val="21"/>
+        </w:rPr>
+        <w:t xml:space="preserve">18. wallets: Quản lý số dư Ví khả dụng &amp; đóng băng của Khách hàng, Thợ, Đại lý, Sàn.</w:t>
+      </w:r>
+    </w:p>
+    <w:p>
+      <w:pPr>
+        <w:pStyle w:val="ListParagraph"/>
+        <w:numPr>
+          <w:ilvl w:val="0"/>
+          <w:numId w:val="1"/>
+        </w:numPr>
+        <w:spacing w:after="40" w:before="40" w:line="260"/>
+      </w:pPr>
+      <w:r>
+        <w:rPr>
+          <w:rFonts w:ascii="Segoe UI" w:cs="Segoe UI" w:eastAsia="Segoe UI" w:hAnsi="Segoe UI"/>
+          <w:color w:val="2D3748"/>
+          <w:sz w:val="21"/>
+          <w:szCs w:val="21"/>
+        </w:rPr>
+        <w:t xml:space="preserve">19. user_bank_accounts: Quản lý danh sách Tài khoản Ngân hàng chính chủ đã liên kết.</w:t>
+      </w:r>
+    </w:p>
+    <w:p>
+      <w:pPr>
+        <w:pStyle w:val="ListParagraph"/>
+        <w:numPr>
+          <w:ilvl w:val="0"/>
+          <w:numId w:val="1"/>
+        </w:numPr>
+        <w:spacing w:after="40" w:before="40" w:line="260"/>
+      </w:pPr>
+      <w:r>
+        <w:rPr>
+          <w:rFonts w:ascii="Segoe UI" w:cs="Segoe UI" w:eastAsia="Segoe UI" w:hAnsi="Segoe UI"/>
+          <w:color w:val="2D3748"/>
+          <w:sz w:val="21"/>
+          <w:szCs w:val="21"/>
+        </w:rPr>
+        <w:t xml:space="preserve">20. withdrawal_requests: Quản lý yêu cầu Rút tiền từ Ví về Ngân hàng (Mã WTH-..., số tiền, phí, số tiền thực nhận).</w:t>
+      </w:r>
+    </w:p>
+    <w:p>
+      <w:pPr>
+        <w:pStyle w:val="ListParagraph"/>
+        <w:numPr>
+          <w:ilvl w:val="0"/>
+          <w:numId w:val="1"/>
+        </w:numPr>
+        <w:spacing w:after="40" w:before="40" w:line="260"/>
+      </w:pPr>
+      <w:r>
+        <w:rPr>
+          <w:rFonts w:ascii="Segoe UI" w:cs="Segoe UI" w:eastAsia="Segoe UI" w:hAnsi="Segoe UI"/>
+          <w:color w:val="2D3748"/>
+          <w:sz w:val="21"/>
+          <w:szCs w:val="21"/>
+        </w:rPr>
+        <w:t xml:space="preserve">21. payment_transactions: Quản lý giao dịch với Cổng thanh toán (MoMo, VNPay, ZaloPay, VietQR, Tiền mặt).</w:t>
+      </w:r>
+    </w:p>
+    <w:p>
+      <w:pPr>
+        <w:pStyle w:val="ListParagraph"/>
+        <w:numPr>
+          <w:ilvl w:val="0"/>
+          <w:numId w:val="1"/>
+        </w:numPr>
+        <w:spacing w:after="40" w:before="40" w:line="260"/>
+      </w:pPr>
+      <w:r>
+        <w:rPr>
+          <w:rFonts w:ascii="Segoe UI" w:cs="Segoe UI" w:eastAsia="Segoe UI" w:hAnsi="Segoe UI"/>
+          <w:color w:val="2D3748"/>
+          <w:sz w:val="21"/>
+          <w:szCs w:val="21"/>
+        </w:rPr>
+        <w:t xml:space="preserve">22. transactions: Bảng Master quản lý giao dịch nghiệp vụ tổng hợp (DEPOSIT, WITHDRAWAL, ESCROW_LOCK, ESCROW_RELEASE, PLATFORM_COMMISSION, REFUND, TIP).</w:t>
+      </w:r>
+    </w:p>
+    <w:p>
+      <w:pPr>
+        <w:pStyle w:val="ListParagraph"/>
+        <w:numPr>
+          <w:ilvl w:val="0"/>
+          <w:numId w:val="1"/>
+        </w:numPr>
+        <w:spacing w:after="40" w:before="40" w:line="260"/>
+      </w:pPr>
+      <w:r>
+        <w:rPr>
+          <w:rFonts w:ascii="Segoe UI" w:cs="Segoe UI" w:eastAsia="Segoe UI" w:hAnsi="Segoe UI"/>
+          <w:color w:val="2D3748"/>
+          <w:sz w:val="21"/>
+          <w:szCs w:val="21"/>
+        </w:rPr>
+        <w:t xml:space="preserve">23. wallet_transactions: Nhật ký sao kê biến động số dư chi tiết của từng Ví (balance_before, balance_after, CREDIT/DEBIT/FREEZE).</w:t>
+      </w:r>
+    </w:p>
+    <w:p>
+      <w:pPr>
+        <w:pStyle w:val="ListParagraph"/>
+        <w:numPr>
+          <w:ilvl w:val="0"/>
+          <w:numId w:val="1"/>
+        </w:numPr>
+        <w:spacing w:after="40" w:before="40" w:line="260"/>
+      </w:pPr>
+      <w:r>
+        <w:rPr>
+          <w:rFonts w:ascii="Segoe UI" w:cs="Segoe UI" w:eastAsia="Segoe UI" w:hAnsi="Segoe UI"/>
+          <w:color w:val="2D3748"/>
+          <w:sz w:val="21"/>
+          <w:szCs w:val="21"/>
+        </w:rPr>
+        <w:t xml:space="preserve">24. ledger_entries: Bảng Sổ cái Kế toán Đúp (Double-Entry General Ledger) hạch toán Nợ (debit_wallet_id) / Có (credit_wallet_id).</w:t>
+      </w:r>
+    </w:p>
+    <w:p>
+      <w:pPr>
+        <w:pStyle w:val="ListParagraph"/>
+        <w:numPr>
+          <w:ilvl w:val="0"/>
+          <w:numId w:val="1"/>
+        </w:numPr>
+        <w:spacing w:after="40" w:before="40" w:line="260"/>
+      </w:pPr>
+      <w:r>
+        <w:rPr>
+          <w:rFonts w:ascii="Segoe UI" w:cs="Segoe UI" w:eastAsia="Segoe UI" w:hAnsi="Segoe UI"/>
+          <w:color w:val="2D3748"/>
+          <w:sz w:val="21"/>
+          <w:szCs w:val="21"/>
+        </w:rPr>
+        <w:t xml:space="preserve">25. in_app_notifications: Lưu trữ thông báo In-App qua Kafka &amp; WebSocket.</w:t>
+      </w:r>
+    </w:p>
+    <w:p>
+      <w:pPr>
+        <w:pStyle w:val="ListParagraph"/>
+        <w:numPr>
+          <w:ilvl w:val="0"/>
+          <w:numId w:val="1"/>
+        </w:numPr>
+        <w:spacing w:after="40" w:before="40" w:line="260"/>
+      </w:pPr>
+      <w:r>
+        <w:rPr>
+          <w:rFonts w:ascii="Segoe UI" w:cs="Segoe UI" w:eastAsia="Segoe UI" w:hAnsi="Segoe UI"/>
+          <w:color w:val="2D3748"/>
+          <w:sz w:val="21"/>
+          <w:szCs w:val="21"/>
+        </w:rPr>
+        <w:t xml:space="preserve">26. reviews &amp; disputes: Đánh giá sao 1-5★, Tip tiền &amp; Đơn khiếu nại (DSP-260908-A9X2K).</w:t>
+      </w:r>
+    </w:p>
     <w:p>
       <w:pPr>
         <w:pStyle w:val="Heading1"/>
@@ -7603,6 +8212,7 @@
       </w:tblGrid>
       <w:tr>
         <w:trPr>
+          <w:cantSplit/>
           <w:tblHeader/>
         </w:trPr>
         <w:tc>
@@ -7747,6 +8357,9 @@
         </w:tc>
       </w:tr>
       <w:tr>
+        <w:trPr>
+          <w:cantSplit/>
+        </w:trPr>
         <w:tc>
           <w:tcPr>
             <w:tcW w:type="pct" w:w="12%"/>
@@ -7915,6 +8528,9 @@
         </w:tc>
       </w:tr>
       <w:tr>
+        <w:trPr>
+          <w:cantSplit/>
+        </w:trPr>
         <w:tc>
           <w:tcPr>
             <w:tcW w:type="pct" w:w="12%"/>
@@ -8062,6 +8678,9 @@
         </w:tc>
       </w:tr>
       <w:tr>
+        <w:trPr>
+          <w:cantSplit/>
+        </w:trPr>
         <w:tc>
           <w:tcPr>
             <w:tcW w:type="pct" w:w="12%"/>
@@ -8147,7 +8766,7 @@
                 <w:sz w:val="19"/>
                 <w:szCs w:val="19"/>
               </w:rPr>
-              <w:t xml:space="preserve">Auth API 3 nhóm (Customer, MUA, Agency), OTP / OAuth2, Phân quyền RBAC.</w:t>
+              <w:t xml:space="preserve">Auth API 3 nhóm (Customer, MUA, Agency), OTP / OAuth2, RBAC 4 Bảng (role_permissions).</w:t>
             </w:r>
           </w:p>
         </w:tc>
@@ -8209,6 +8828,9 @@
         </w:tc>
       </w:tr>
       <w:tr>
+        <w:trPr>
+          <w:cantSplit/>
+        </w:trPr>
         <w:tc>
           <w:tcPr>
             <w:tcW w:type="pct" w:w="12%"/>
@@ -8356,6 +8978,9 @@
         </w:tc>
       </w:tr>
       <w:tr>
+        <w:trPr>
+          <w:cantSplit/>
+        </w:trPr>
         <w:tc>
           <w:tcPr>
             <w:tcW w:type="pct" w:w="12%"/>
@@ -8503,6 +9128,9 @@
         </w:tc>
       </w:tr>
       <w:tr>
+        <w:trPr>
+          <w:cantSplit/>
+        </w:trPr>
         <w:tc>
           <w:tcPr>
             <w:tcW w:type="pct" w:w="12%"/>
@@ -8650,6 +9278,9 @@
         </w:tc>
       </w:tr>
       <w:tr>
+        <w:trPr>
+          <w:cantSplit/>
+        </w:trPr>
         <w:tc>
           <w:tcPr>
             <w:tcW w:type="pct" w:w="12%"/>
@@ -8797,6 +9428,9 @@
         </w:tc>
       </w:tr>
       <w:tr>
+        <w:trPr>
+          <w:cantSplit/>
+        </w:trPr>
         <w:tc>
           <w:tcPr>
             <w:tcW w:type="pct" w:w="12%"/>
@@ -8944,6 +9578,9 @@
         </w:tc>
       </w:tr>
       <w:tr>
+        <w:trPr>
+          <w:cantSplit/>
+        </w:trPr>
         <w:tc>
           <w:tcPr>
             <w:tcW w:type="pct" w:w="12%"/>
@@ -9091,6 +9728,9 @@
         </w:tc>
       </w:tr>
       <w:tr>
+        <w:trPr>
+          <w:cantSplit/>
+        </w:trPr>
         <w:tc>
           <w:tcPr>
             <w:tcW w:type="pct" w:w="12%"/>
@@ -9238,6 +9878,9 @@
         </w:tc>
       </w:tr>
       <w:tr>
+        <w:trPr>
+          <w:cantSplit/>
+        </w:trPr>
         <w:tc>
           <w:tcPr>
             <w:tcW w:type="pct" w:w="12%"/>
@@ -9385,6 +10028,9 @@
         </w:tc>
       </w:tr>
       <w:tr>
+        <w:trPr>
+          <w:cantSplit/>
+        </w:trPr>
         <w:tc>
           <w:tcPr>
             <w:tcW w:type="pct" w:w="12%"/>
@@ -9532,6 +10178,9 @@
         </w:tc>
       </w:tr>
       <w:tr>
+        <w:trPr>
+          <w:cantSplit/>
+        </w:trPr>
         <w:tc>
           <w:tcPr>
             <w:tcW w:type="pct" w:w="12%"/>
@@ -9679,6 +10328,9 @@
         </w:tc>
       </w:tr>
       <w:tr>
+        <w:trPr>
+          <w:cantSplit/>
+        </w:trPr>
         <w:tc>
           <w:tcPr>
             <w:tcW w:type="pct" w:w="12%"/>
@@ -9826,6 +10478,9 @@
         </w:tc>
       </w:tr>
       <w:tr>
+        <w:trPr>
+          <w:cantSplit/>
+        </w:trPr>
         <w:tc>
           <w:tcPr>
             <w:tcW w:type="pct" w:w="12%"/>
@@ -9973,6 +10628,9 @@
         </w:tc>
       </w:tr>
       <w:tr>
+        <w:trPr>
+          <w:cantSplit/>
+        </w:trPr>
         <w:tc>
           <w:tcPr>
             <w:tcW w:type="pct" w:w="12%"/>
@@ -10120,6 +10778,9 @@
         </w:tc>
       </w:tr>
       <w:tr>
+        <w:trPr>
+          <w:cantSplit/>
+        </w:trPr>
         <w:tc>
           <w:tcPr>
             <w:tcW w:type="pct" w:w="12%"/>
@@ -10267,6 +10928,9 @@
         </w:tc>
       </w:tr>
       <w:tr>
+        <w:trPr>
+          <w:cantSplit/>
+        </w:trPr>
         <w:tc>
           <w:tcPr>
             <w:tcW w:type="pct" w:w="12%"/>
@@ -10414,6 +11078,9 @@
         </w:tc>
       </w:tr>
       <w:tr>
+        <w:trPr>
+          <w:cantSplit/>
+        </w:trPr>
         <w:tc>
           <w:tcPr>
             <w:tcW w:type="pct" w:w="12%"/>
@@ -10561,6 +11228,9 @@
         </w:tc>
       </w:tr>
       <w:tr>
+        <w:trPr>
+          <w:cantSplit/>
+        </w:trPr>
         <w:tc>
           <w:tcPr>
             <w:tcW w:type="pct" w:w="12%"/>

</xml_diff>